<commit_message>
Puente de datos para el mail
</commit_message>
<xml_diff>
--- a/gestor_reservas_backend/backend_documentacion/7. Librerias para mail y pasarela de pago.docx
+++ b/gestor_reservas_backend/backend_documentacion/7. Librerias para mail y pasarela de pago.docx
@@ -3,71 +3,82 @@
 <w:document xmlns:wpc="http://schemas.microsoft.com/office/word/2010/wordprocessingCanvas" xmlns:cx="http://schemas.microsoft.com/office/drawing/2014/chartex" xmlns:cx1="http://schemas.microsoft.com/office/drawing/2015/9/8/chartex" xmlns:cx2="http://schemas.microsoft.com/office/drawing/2015/10/21/chartex" xmlns:cx3="http://schemas.microsoft.com/office/drawing/2016/5/9/chartex" xmlns:cx4="http://schemas.microsoft.com/office/drawing/2016/5/10/chartex" xmlns:cx5="http://schemas.microsoft.com/office/drawing/2016/5/11/chartex" xmlns:cx6="http://schemas.microsoft.com/office/drawing/2016/5/12/chartex" xmlns:cx7="http://schemas.microsoft.com/office/drawing/2016/5/13/chartex" xmlns:cx8="http://schemas.microsoft.com/office/drawing/2016/5/14/chartex" xmlns:mc="http://schemas.openxmlformats.org/markup-compatibility/2006" xmlns:aink="http://schemas.microsoft.com/office/drawing/2016/ink" xmlns:am3d="http://schemas.microsoft.com/office/drawing/2017/model3d" xmlns:o="urn:schemas-microsoft-com:office:office" xmlns:oel="http://schemas.microsoft.com/office/2019/extlst" xmlns:r="http://schemas.openxmlformats.org/officeDocument/2006/relationships" xmlns:m="http://schemas.openxmlformats.org/officeDocument/2006/math" xmlns:v="urn:schemas-microsoft-com:vml" xmlns:wp14="http://schemas.microsoft.com/office/word/2010/wordprocessingDrawing" xmlns:wp="http://schemas.openxmlformats.org/drawingml/2006/wordprocessingDrawing" xmlns:w10="urn:schemas-microsoft-com:office:word" xmlns:w="http://schemas.openxmlformats.org/wordprocessingml/2006/main" xmlns:w14="http://schemas.microsoft.com/office/word/2010/wordml" xmlns:w15="http://schemas.microsoft.com/office/word/2012/wordml" xmlns:w16cex="http://schemas.microsoft.com/office/word/2018/wordml/cex" xmlns:w16cid="http://schemas.microsoft.com/office/word/2016/wordml/cid" xmlns:w16="http://schemas.microsoft.com/office/word/2018/wordml" xmlns:w16du="http://schemas.microsoft.com/office/word/2023/wordml/word16du" xmlns:w16sdtdh="http://schemas.microsoft.com/office/word/2020/wordml/sdtdatahash" xmlns:w16sdtfl="http://schemas.microsoft.com/office/word/2024/wordml/sdtformatlock" xmlns:w16se="http://schemas.microsoft.com/office/word/2015/wordml/symex" xmlns:wpg="http://schemas.microsoft.com/office/word/2010/wordprocessingGroup" xmlns:wpi="http://schemas.microsoft.com/office/word/2010/wordprocessingInk" xmlns:wne="http://schemas.microsoft.com/office/word/2006/wordml" xmlns:wps="http://schemas.microsoft.com/office/word/2010/wordprocessingShape" mc:Ignorable="w14 w15 w16se w16cid w16 w16cex w16sdtdh w16sdtfl w16du wp14">
   <w:body>
     <w:p>
-      <w:r>
-        <w:t xml:space="preserve">el estándar de la industria es </w:t>
-      </w:r>
-      <w:r>
+      <w:pPr>
         <w:rPr>
           <w:b/>
           <w:bCs/>
-        </w:rPr>
-        <w:t>Stripe</w:t>
-      </w:r>
-      <w:r>
-        <w:t xml:space="preserve"> (para los pagos) y </w:t>
-      </w:r>
-      <w:proofErr w:type="spellStart"/>
+          <w:u w:val="single"/>
+        </w:rPr>
+      </w:pPr>
       <w:r>
         <w:rPr>
           <w:b/>
           <w:bCs/>
-        </w:rPr>
-        <w:t>Nodemailer</w:t>
-      </w:r>
-      <w:proofErr w:type="spellEnd"/>
-      <w:r>
-        <w:t xml:space="preserve"> o </w:t>
-      </w:r>
-      <w:proofErr w:type="spellStart"/>
+          <w:highlight w:val="yellow"/>
+          <w:u w:val="single"/>
+        </w:rPr>
+        <w:t>(NOTA: Antes de continuar aquí en el backend con los puntos 7 y 8, tienes que hacer el forntend</w:t>
+      </w:r>
       <w:r>
         <w:rPr>
           <w:b/>
           <w:bCs/>
+          <w:highlight w:val="yellow"/>
+          <w:u w:val="single"/>
+        </w:rPr>
+        <w:t>, de los puntos 1 al 17</w:t>
+      </w:r>
+      <w:r>
+        <w:rPr>
+          <w:b/>
+          <w:bCs/>
+          <w:highlight w:val="yellow"/>
+          <w:u w:val="single"/>
+        </w:rPr>
+        <w:t>)</w:t>
+      </w:r>
+    </w:p>
+    <w:p>
+      <w:r>
+        <w:t>E</w:t>
+      </w:r>
+      <w:r>
+        <w:t xml:space="preserve">l estándar de la industria es </w:t>
+      </w:r>
+      <w:r>
+        <w:rPr>
+          <w:b/>
+          <w:bCs/>
+        </w:rPr>
+        <w:t>Stripe</w:t>
+      </w:r>
+      <w:r>
+        <w:t xml:space="preserve"> (para los pagos) y </w:t>
+      </w:r>
+      <w:r>
+        <w:rPr>
+          <w:b/>
+          <w:bCs/>
+        </w:rPr>
+        <w:t>Nodemailer</w:t>
+      </w:r>
+      <w:r>
+        <w:t xml:space="preserve"> o </w:t>
+      </w:r>
+      <w:r>
+        <w:rPr>
+          <w:b/>
+          <w:bCs/>
         </w:rPr>
         <w:t>SendGrid</w:t>
       </w:r>
-      <w:proofErr w:type="spellEnd"/>
       <w:r>
         <w:t xml:space="preserve"> (para los correos).</w:t>
       </w:r>
     </w:p>
     <w:p>
       <w:r>
-        <w:t xml:space="preserve">instala la librería: </w:t>
-      </w:r>
-      <w:proofErr w:type="spellStart"/>
-      <w:r>
-        <w:t>npm</w:t>
-      </w:r>
-      <w:proofErr w:type="spellEnd"/>
-      <w:r>
-        <w:t xml:space="preserve"> </w:t>
-      </w:r>
-      <w:proofErr w:type="spellStart"/>
-      <w:r>
-        <w:t>install</w:t>
-      </w:r>
-      <w:proofErr w:type="spellEnd"/>
-      <w:r>
-        <w:t xml:space="preserve"> </w:t>
-      </w:r>
-      <w:proofErr w:type="spellStart"/>
-      <w:r>
-        <w:t>nodemailer</w:t>
-      </w:r>
-      <w:proofErr w:type="spellEnd"/>
-      <w:r>
-        <w:t xml:space="preserve"> y su tipo @types/nodemailer</w:t>
+        <w:t>instala la librería: npm install nodemailer y su tipo @types/nodemailer</w:t>
       </w:r>
     </w:p>
     <w:p>
@@ -155,29 +166,11 @@
       </w:r>
     </w:p>
     <w:p>
-      <w:proofErr w:type="spellStart"/>
-      <w:r>
-        <w:t>npm</w:t>
-      </w:r>
-      <w:proofErr w:type="spellEnd"/>
-      <w:r>
-        <w:t xml:space="preserve"> </w:t>
-      </w:r>
-      <w:proofErr w:type="spellStart"/>
-      <w:r>
-        <w:t>install</w:t>
-      </w:r>
-      <w:proofErr w:type="spellEnd"/>
-      <w:r>
-        <w:t xml:space="preserve"> --</w:t>
-      </w:r>
-      <w:proofErr w:type="spellStart"/>
-      <w:r>
-        <w:t>save-dev</w:t>
-      </w:r>
-      <w:proofErr w:type="spellEnd"/>
-      <w:r>
-        <w:t xml:space="preserve"> @types/nodemailer</w:t>
+      <w:pPr>
+        <w:ind w:left="1416" w:hanging="1416"/>
+      </w:pPr>
+      <w:r>
+        <w:t>npm install --save-dev @types/nodemailer</w:t>
       </w:r>
     </w:p>
     <w:p>
@@ -224,23 +217,7 @@
     </w:p>
     <w:p>
       <w:r>
-        <w:t xml:space="preserve">El </w:t>
-      </w:r>
-      <w:proofErr w:type="spellStart"/>
-      <w:r>
-        <w:t>flag</w:t>
-      </w:r>
-      <w:proofErr w:type="spellEnd"/>
-      <w:r>
-        <w:t xml:space="preserve"> --</w:t>
-      </w:r>
-      <w:proofErr w:type="spellStart"/>
-      <w:r>
-        <w:t>save-dev</w:t>
-      </w:r>
-      <w:proofErr w:type="spellEnd"/>
-      <w:r>
-        <w:t xml:space="preserve"> es porque los tipos solo los necesitas mientras programas (en desarrollo), no cuando la aplicación ya está funcionando en producción.</w:t>
+        <w:t>El flag --save-dev es porque los tipos solo los necesitas mientras programas (en desarrollo), no cuando la aplicación ya está funcionando en producción.</w:t>
       </w:r>
     </w:p>
     <w:p>
@@ -287,23 +264,7 @@
     </w:p>
     <w:p>
       <w:r>
-        <w:t>Crea un servicio de correos (</w:t>
-      </w:r>
-      <w:proofErr w:type="spellStart"/>
-      <w:r>
-        <w:t>services</w:t>
-      </w:r>
-      <w:proofErr w:type="spellEnd"/>
-      <w:r>
-        <w:t>/</w:t>
-      </w:r>
-      <w:proofErr w:type="spellStart"/>
-      <w:r>
-        <w:t>email.service.ts</w:t>
-      </w:r>
-      <w:proofErr w:type="spellEnd"/>
-      <w:r>
-        <w:t>)</w:t>
+        <w:t>Crea un servicio de correos (services/email.service.ts)</w:t>
       </w:r>
     </w:p>
     <w:p>
@@ -350,9 +311,9 @@
     </w:p>
     <w:p>
       <w:r>
+        <w:lastRenderedPageBreak/>
         <w:t xml:space="preserve">Creo el </w:t>
       </w:r>
-      <w:proofErr w:type="spellStart"/>
       <w:proofErr w:type="gramStart"/>
       <w:r>
         <w:t>email.service</w:t>
@@ -361,14 +322,12 @@
       <w:r>
         <w:t>.ts</w:t>
       </w:r>
-      <w:proofErr w:type="spellEnd"/>
     </w:p>
     <w:p>
       <w:r>
         <w:rPr>
           <w:noProof/>
         </w:rPr>
-        <w:lastRenderedPageBreak/>
         <w:drawing>
           <wp:inline distT="0" distB="0" distL="0" distR="0" wp14:anchorId="11A242A7" wp14:editId="0B1992C4">
             <wp:extent cx="6645910" cy="4178300"/>
@@ -450,13 +409,8 @@
     </w:p>
     <w:p>
       <w:r>
-        <w:t xml:space="preserve">Añado el </w:t>
-      </w:r>
-      <w:proofErr w:type="spellStart"/>
-      <w:r>
-        <w:t>codigo</w:t>
-      </w:r>
-      <w:proofErr w:type="spellEnd"/>
+        <w:t>Añado el codigo</w:t>
+      </w:r>
     </w:p>
     <w:p>
       <w:r>
@@ -464,13 +418,8 @@
       </w:r>
       <w:proofErr w:type="gramStart"/>
       <w:r>
-        <w:t>archivo .</w:t>
-      </w:r>
-      <w:proofErr w:type="spellStart"/>
-      <w:r>
-        <w:t>env</w:t>
-      </w:r>
-      <w:proofErr w:type="spellEnd"/>
+        <w:t>archivo .env</w:t>
+      </w:r>
       <w:proofErr w:type="gramEnd"/>
       <w:r>
         <w:t xml:space="preserve"> permite que esa información se quede solo en tu ordenador.</w:t>
@@ -481,6 +430,7 @@
         <w:rPr>
           <w:noProof/>
         </w:rPr>
+        <w:lastRenderedPageBreak/>
         <mc:AlternateContent>
           <mc:Choice Requires="wps">
             <w:drawing>
@@ -548,6 +498,9 @@
         </mc:AlternateContent>
       </w:r>
       <w:r>
+        <w:rPr>
+          <w:noProof/>
+        </w:rPr>
         <w:drawing>
           <wp:inline distT="0" distB="0" distL="0" distR="0" wp14:anchorId="6F064E00" wp14:editId="5FEB4976">
             <wp:extent cx="6525536" cy="3886742"/>
@@ -586,12 +539,9 @@
       </w:r>
     </w:p>
     <w:p>
-      <w:proofErr w:type="spellStart"/>
-      <w:r>
-        <w:lastRenderedPageBreak/>
+      <w:r>
         <w:t>Actuaizo</w:t>
       </w:r>
-      <w:proofErr w:type="spellEnd"/>
       <w:r>
         <w:t xml:space="preserve"> el </w:t>
       </w:r>
@@ -603,13 +553,8 @@
         <w:t xml:space="preserve"> </w:t>
       </w:r>
       <w:r>
-        <w:t>.</w:t>
-      </w:r>
-      <w:proofErr w:type="spellStart"/>
-      <w:r>
-        <w:t>env</w:t>
-      </w:r>
-      <w:proofErr w:type="spellEnd"/>
+        <w:t>.env</w:t>
+      </w:r>
       <w:proofErr w:type="gramEnd"/>
     </w:p>
     <w:p>
@@ -656,15 +601,7 @@
     </w:p>
     <w:p>
       <w:r>
-        <w:t xml:space="preserve">Para que Node.js pueda leer ese archivo, necesitas una librería llamada </w:t>
-      </w:r>
-      <w:proofErr w:type="spellStart"/>
-      <w:r>
-        <w:t>dotenv</w:t>
-      </w:r>
-      <w:proofErr w:type="spellEnd"/>
-      <w:r>
-        <w:t>.</w:t>
+        <w:t>Para que Node.js pueda leer ese archivo, necesitas una librería llamada dotenv.</w:t>
       </w:r>
     </w:p>
     <w:p>
@@ -777,6 +714,7 @@
         <w:rPr>
           <w:noProof/>
         </w:rPr>
+        <w:lastRenderedPageBreak/>
         <w:drawing>
           <wp:inline distT="0" distB="0" distL="0" distR="0" wp14:anchorId="06CD6BDF" wp14:editId="4715943C">
             <wp:extent cx="6645910" cy="3154680"/>
@@ -860,7 +798,6 @@
       <w:r>
         <w:t xml:space="preserve">Actualizo mi archivo de </w:t>
       </w:r>
-      <w:proofErr w:type="spellStart"/>
       <w:proofErr w:type="gramStart"/>
       <w:r>
         <w:t>email.service</w:t>
@@ -869,14 +806,12 @@
       <w:r>
         <w:t>.ts</w:t>
       </w:r>
-      <w:proofErr w:type="spellEnd"/>
     </w:p>
     <w:p>
       <w:r>
         <w:rPr>
           <w:noProof/>
         </w:rPr>
-        <w:lastRenderedPageBreak/>
         <w:drawing>
           <wp:inline distT="0" distB="0" distL="0" distR="0" wp14:anchorId="3D150CFC" wp14:editId="6BA00346">
             <wp:extent cx="4782217" cy="1762371"/>
@@ -929,13 +864,8 @@
         <w:t xml:space="preserve"> </w:t>
       </w:r>
       <w:r>
-        <w:t>.</w:t>
-      </w:r>
-      <w:proofErr w:type="spellStart"/>
-      <w:r>
-        <w:t>gitignore</w:t>
-      </w:r>
-      <w:proofErr w:type="spellEnd"/>
+        <w:t>.gitignore</w:t>
+      </w:r>
       <w:proofErr w:type="gramEnd"/>
       <w:r>
         <w:t xml:space="preserve"> </w:t>
@@ -948,13 +878,8 @@
       </w:r>
       <w:proofErr w:type="gramStart"/>
       <w:r>
-        <w:t>: .</w:t>
-      </w:r>
-      <w:proofErr w:type="spellStart"/>
-      <w:r>
-        <w:t>env</w:t>
-      </w:r>
-      <w:proofErr w:type="spellEnd"/>
+        <w:t>: .env</w:t>
+      </w:r>
       <w:proofErr w:type="gramEnd"/>
     </w:p>
     <w:p>
@@ -982,7 +907,6 @@
       <w:r>
         <w:t xml:space="preserve">Para que esto funcione de forma automatizada, necesitaremos un </w:t>
       </w:r>
-      <w:proofErr w:type="spellStart"/>
       <w:r>
         <w:rPr>
           <w:b/>
@@ -990,7 +914,6 @@
         </w:rPr>
         <w:t>Webhook</w:t>
       </w:r>
-      <w:proofErr w:type="spellEnd"/>
       <w:r>
         <w:t xml:space="preserve">. Es como una "puerta trasera" de tu servidor que Stripe golpea para avisar: </w:t>
       </w:r>
@@ -1031,14 +954,9 @@
       <w:r>
         <w:t xml:space="preserve"> Llamas a </w:t>
       </w:r>
-      <w:proofErr w:type="spellStart"/>
       <w:proofErr w:type="gramStart"/>
       <w:r>
-        <w:t>sendReservationEmail</w:t>
-      </w:r>
-      <w:proofErr w:type="spellEnd"/>
-      <w:r>
-        <w:t>(</w:t>
+        <w:t>sendReservationEmail(</w:t>
       </w:r>
       <w:proofErr w:type="gramEnd"/>
       <w:r>
@@ -1057,35 +975,15 @@
           <w:b/>
           <w:bCs/>
         </w:rPr>
-        <w:t xml:space="preserve">En el controlador de </w:t>
-      </w:r>
-      <w:proofErr w:type="spellStart"/>
-      <w:r>
-        <w:rPr>
-          <w:b/>
-          <w:bCs/>
-        </w:rPr>
-        <w:t>Webhooks</w:t>
-      </w:r>
-      <w:proofErr w:type="spellEnd"/>
-      <w:r>
-        <w:rPr>
-          <w:b/>
-          <w:bCs/>
-        </w:rPr>
-        <w:t xml:space="preserve"> de Stripe:</w:t>
+        <w:lastRenderedPageBreak/>
+        <w:t>En el controlador de Webhooks de Stripe:</w:t>
       </w:r>
       <w:r>
         <w:t xml:space="preserve"> Cuando Stripe confirme el éxito, buscas esa reserva en tu base de datos y llamas a </w:t>
       </w:r>
-      <w:proofErr w:type="spellStart"/>
       <w:proofErr w:type="gramStart"/>
       <w:r>
-        <w:t>sendReservationEmail</w:t>
-      </w:r>
-      <w:proofErr w:type="spellEnd"/>
-      <w:r>
-        <w:t>(</w:t>
+        <w:t>sendReservationEmail(</w:t>
       </w:r>
       <w:proofErr w:type="gramEnd"/>
       <w:r>
@@ -1234,7 +1132,6 @@
         <w:rPr>
           <w:noProof/>
         </w:rPr>
-        <w:lastRenderedPageBreak/>
         <w:drawing>
           <wp:inline distT="0" distB="0" distL="0" distR="0" wp14:anchorId="0FECCBE8" wp14:editId="3AC38A8E">
             <wp:extent cx="6645910" cy="5501005"/>
@@ -1276,18 +1173,13 @@
       <w:r>
         <w:t xml:space="preserve">Actualizo </w:t>
       </w:r>
-      <w:proofErr w:type="spellStart"/>
       <w:proofErr w:type="gramStart"/>
       <w:r>
         <w:t>reservation.controller</w:t>
       </w:r>
       <w:proofErr w:type="gramEnd"/>
       <w:r>
-        <w:t>.ts</w:t>
-      </w:r>
-      <w:proofErr w:type="spellEnd"/>
-      <w:r>
-        <w:t xml:space="preserve"> </w:t>
+        <w:t xml:space="preserve">.ts </w:t>
       </w:r>
     </w:p>
     <w:p>
@@ -1300,15 +1192,7 @@
     </w:p>
     <w:p>
       <w:r>
-        <w:t xml:space="preserve">Y en </w:t>
-      </w:r>
-      <w:proofErr w:type="spellStart"/>
-      <w:r>
-        <w:t>createReservation</w:t>
-      </w:r>
-      <w:proofErr w:type="spellEnd"/>
-      <w:r>
-        <w:t>,</w:t>
+        <w:t>Y en createReservation,</w:t>
       </w:r>
       <w:r>
         <w:t xml:space="preserve"> el envío del primer correo.</w:t>
@@ -1316,23 +1200,7 @@
     </w:p>
     <w:p>
       <w:r>
-        <w:t xml:space="preserve">ahora usamos el email para el primer correo y pasamos el </w:t>
-      </w:r>
-      <w:proofErr w:type="spellStart"/>
-      <w:r>
-        <w:t>url</w:t>
-      </w:r>
-      <w:proofErr w:type="spellEnd"/>
-      <w:r>
-        <w:t xml:space="preserve"> de Stripe al </w:t>
-      </w:r>
-      <w:proofErr w:type="spellStart"/>
-      <w:r>
-        <w:t>frontend</w:t>
-      </w:r>
-      <w:proofErr w:type="spellEnd"/>
-      <w:r>
-        <w:t>:</w:t>
+        <w:t>ahora usamos el email para el primer correo y pasamos el url de Stripe al frontend:</w:t>
       </w:r>
     </w:p>
     <w:p>
@@ -1340,6 +1208,7 @@
         <w:rPr>
           <w:noProof/>
         </w:rPr>
+        <w:lastRenderedPageBreak/>
         <w:drawing>
           <wp:inline distT="0" distB="0" distL="0" distR="0" wp14:anchorId="7DA5AA78" wp14:editId="2FA466F1">
             <wp:extent cx="6645910" cy="2593975"/>
@@ -1379,10 +1248,8 @@
     </w:p>
     <w:p>
       <w:r>
-        <w:lastRenderedPageBreak/>
         <w:t xml:space="preserve">Actualizo el </w:t>
       </w:r>
-      <w:proofErr w:type="spellStart"/>
       <w:proofErr w:type="gramStart"/>
       <w:r>
         <w:t>auth.middleware</w:t>
@@ -1391,25 +1258,11 @@
       <w:r>
         <w:t>.ts</w:t>
       </w:r>
-      <w:proofErr w:type="spellEnd"/>
-    </w:p>
-    <w:p>
-      <w:r>
-        <w:t xml:space="preserve">Para que </w:t>
-      </w:r>
-      <w:proofErr w:type="spellStart"/>
-      <w:r>
-        <w:t>TypeScript</w:t>
-      </w:r>
-      <w:proofErr w:type="spellEnd"/>
-      <w:r>
-        <w:t xml:space="preserve"> no se queje y para asegurarnos de que el email esté ahí, vamos a forzar la estructura. El cambio es sutil pero importante en la línea del </w:t>
-      </w:r>
-      <w:proofErr w:type="spellStart"/>
-      <w:r>
-        <w:t>decoded</w:t>
-      </w:r>
-      <w:proofErr w:type="spellEnd"/>
+    </w:p>
+    <w:p>
+      <w:r>
+        <w:t>Para que TypeScript no se queje y para asegurarnos de que el email esté ahí, vamos a forzar la estructura. El cambio es sutil pero importante en la línea del decoded</w:t>
+      </w:r>
     </w:p>
     <w:p>
       <w:r>
@@ -1425,21 +1278,8 @@
         <w:t>el</w:t>
       </w:r>
       <w:r>
-        <w:t xml:space="preserve"> </w:t>
-      </w:r>
-      <w:proofErr w:type="spellStart"/>
-      <w:r>
-        <w:t>authMiddleware</w:t>
-      </w:r>
-      <w:proofErr w:type="spellEnd"/>
-      <w:r>
-        <w:t xml:space="preserve"> no solo guarde el id, sino también el email en </w:t>
-      </w:r>
-      <w:proofErr w:type="spellStart"/>
-      <w:r>
-        <w:t>req.user</w:t>
-      </w:r>
-      <w:proofErr w:type="spellEnd"/>
+        <w:t xml:space="preserve"> authMiddleware no solo guarde el id, sino también el email en req.user</w:t>
+      </w:r>
     </w:p>
     <w:p>
       <w:r>
@@ -1487,7 +1327,6 @@
       <w:r>
         <w:t xml:space="preserve">Actualizo el </w:t>
       </w:r>
-      <w:proofErr w:type="spellStart"/>
       <w:proofErr w:type="gramStart"/>
       <w:r>
         <w:t>reservation.service</w:t>
@@ -1496,7 +1335,6 @@
       <w:r>
         <w:t>.ts</w:t>
       </w:r>
-      <w:proofErr w:type="spellEnd"/>
     </w:p>
     <w:p>
       <w:r>
@@ -1544,7 +1382,6 @@
       <w:r>
         <w:t xml:space="preserve">Actualizo mi </w:t>
       </w:r>
-      <w:proofErr w:type="spellStart"/>
       <w:proofErr w:type="gramStart"/>
       <w:r>
         <w:t>reservation.repository</w:t>
@@ -1553,10 +1390,13 @@
       <w:r>
         <w:t>.ts</w:t>
       </w:r>
-      <w:proofErr w:type="spellEnd"/>
-    </w:p>
-    <w:p>
-      <w:r>
+    </w:p>
+    <w:p>
+      <w:r>
+        <w:rPr>
+          <w:noProof/>
+        </w:rPr>
+        <w:lastRenderedPageBreak/>
         <w:drawing>
           <wp:inline distT="0" distB="0" distL="0" distR="0" wp14:anchorId="069C664C" wp14:editId="09F325E3">
             <wp:extent cx="6645910" cy="1805305"/>
@@ -1596,20 +1436,17 @@
     </w:p>
     <w:p>
       <w:r>
-        <w:t xml:space="preserve">Actualizo </w:t>
-      </w:r>
-      <w:proofErr w:type="spellStart"/>
-      <w:r>
-        <w:t>server.ts</w:t>
-      </w:r>
-      <w:proofErr w:type="spellEnd"/>
+        <w:t>Actualizo server.ts</w:t>
+      </w:r>
       <w:r>
         <w:t xml:space="preserve"> </w:t>
       </w:r>
     </w:p>
     <w:p>
       <w:r>
-        <w:lastRenderedPageBreak/>
+        <w:rPr>
+          <w:noProof/>
+        </w:rPr>
         <w:drawing>
           <wp:inline distT="0" distB="0" distL="0" distR="0" wp14:anchorId="179D6E88" wp14:editId="0DA60B69">
             <wp:extent cx="6325483" cy="1419423"/>
@@ -1651,7 +1488,6 @@
       <w:r>
         <w:t xml:space="preserve">Actualizo mi </w:t>
       </w:r>
-      <w:proofErr w:type="spellStart"/>
       <w:proofErr w:type="gramStart"/>
       <w:r>
         <w:t>auth.service</w:t>
@@ -1660,7 +1496,6 @@
       <w:r>
         <w:t>.ts</w:t>
       </w:r>
-      <w:proofErr w:type="spellEnd"/>
     </w:p>
     <w:p>
       <w:r>
@@ -1670,15 +1505,7 @@
         <w:t>o</w:t>
       </w:r>
       <w:r>
-        <w:t xml:space="preserve"> la llamada a </w:t>
-      </w:r>
-      <w:proofErr w:type="spellStart"/>
-      <w:r>
-        <w:t>generateToken</w:t>
-      </w:r>
-      <w:proofErr w:type="spellEnd"/>
-      <w:r>
-        <w:t xml:space="preserve"> para que incluya el email del usuario que</w:t>
+        <w:t xml:space="preserve"> la llamada a generateToken para que incluya el email del usuario que</w:t>
       </w:r>
       <w:r>
         <w:t xml:space="preserve"> se</w:t>
@@ -1737,7 +1564,6 @@
       <w:r>
         <w:t xml:space="preserve"> </w:t>
       </w:r>
-      <w:proofErr w:type="spellStart"/>
       <w:proofErr w:type="gramStart"/>
       <w:r>
         <w:t>reservation.routes</w:t>
@@ -1746,10 +1572,12 @@
       <w:r>
         <w:t>.ts</w:t>
       </w:r>
-      <w:proofErr w:type="spellEnd"/>
-    </w:p>
-    <w:p>
-      <w:r>
+    </w:p>
+    <w:p>
+      <w:r>
+        <w:rPr>
+          <w:noProof/>
+        </w:rPr>
         <w:drawing>
           <wp:inline distT="0" distB="0" distL="0" distR="0" wp14:anchorId="5042E5D6" wp14:editId="20D1EC98">
             <wp:extent cx="6645910" cy="283845"/>
@@ -1789,6 +1617,9 @@
     </w:p>
     <w:p>
       <w:r>
+        <w:rPr>
+          <w:noProof/>
+        </w:rPr>
         <w:drawing>
           <wp:inline distT="0" distB="0" distL="0" distR="0" wp14:anchorId="06582138" wp14:editId="2EC19FED">
             <wp:extent cx="6645910" cy="3104515"/>
@@ -1834,7 +1665,9 @@
     <w:p/>
     <w:p>
       <w:r>
-        <w:lastRenderedPageBreak/>
+        <w:rPr>
+          <w:noProof/>
+        </w:rPr>
         <w:drawing>
           <wp:inline distT="0" distB="0" distL="0" distR="0" wp14:anchorId="68DDB266" wp14:editId="14422C9B">
             <wp:extent cx="6645910" cy="1085850"/>
@@ -1877,19 +1710,14 @@
         <w:t xml:space="preserve">Hago un método post en Thunder Client para </w:t>
       </w:r>
       <w:r>
-        <w:t xml:space="preserve">que me </w:t>
-      </w:r>
-      <w:proofErr w:type="spellStart"/>
-      <w:r>
-        <w:t>de</w:t>
-      </w:r>
-      <w:proofErr w:type="spellEnd"/>
-      <w:r>
-        <w:t xml:space="preserve"> un token </w:t>
-      </w:r>
-    </w:p>
-    <w:p>
-      <w:r>
+        <w:t xml:space="preserve">que me de un token </w:t>
+      </w:r>
+    </w:p>
+    <w:p>
+      <w:r>
+        <w:rPr>
+          <w:noProof/>
+        </w:rPr>
         <w:drawing>
           <wp:inline distT="0" distB="0" distL="0" distR="0" wp14:anchorId="0776F52E" wp14:editId="156197D9">
             <wp:extent cx="6645910" cy="1176655"/>
@@ -1929,15 +1757,7 @@
     </w:p>
     <w:p>
       <w:r>
-        <w:t xml:space="preserve">Y luego hago un método </w:t>
-      </w:r>
-      <w:proofErr w:type="spellStart"/>
-      <w:r>
-        <w:t>get</w:t>
-      </w:r>
-      <w:proofErr w:type="spellEnd"/>
-      <w:r>
-        <w:t xml:space="preserve"> </w:t>
+        <w:t xml:space="preserve">Y luego hago un método get </w:t>
       </w:r>
       <w:r>
         <w:t>para ver el mensaje que me devuelve</w:t>
@@ -1998,7 +1818,6 @@
           <w:numId w:val="3"/>
         </w:numPr>
       </w:pPr>
-      <w:proofErr w:type="spellStart"/>
       <w:r>
         <w:rPr>
           <w:b/>
@@ -2006,13 +1825,16 @@
         </w:rPr>
         <w:t>Nodemailer</w:t>
       </w:r>
-      <w:proofErr w:type="spellEnd"/>
       <w:r>
         <w:t xml:space="preserve"> ha conectado con Gmail, ha autenticado tu cuenta y ha aceptado el envío.</w:t>
       </w:r>
     </w:p>
     <w:p>
       <w:r>
+        <w:rPr>
+          <w:noProof/>
+        </w:rPr>
+        <w:lastRenderedPageBreak/>
         <w:drawing>
           <wp:inline distT="0" distB="0" distL="0" distR="0" wp14:anchorId="6E088723" wp14:editId="4DC62D2E">
             <wp:extent cx="6645910" cy="4236720"/>
@@ -2052,6 +1874,9 @@
     </w:p>
     <w:p>
       <w:r>
+        <w:rPr>
+          <w:noProof/>
+        </w:rPr>
         <w:lastRenderedPageBreak/>
         <w:drawing>
           <wp:inline distT="0" distB="0" distL="0" distR="0" wp14:anchorId="06CF07DB" wp14:editId="4F6D1906">
@@ -3057,6 +2882,7 @@
   <w:style w:type="character" w:default="1" w:styleId="Fuentedeprrafopredeter">
     <w:name w:val="Default Paragraph Font"/>
     <w:uiPriority w:val="1"/>
+    <w:semiHidden/>
     <w:unhideWhenUsed/>
   </w:style>
   <w:style w:type="table" w:default="1" w:styleId="Tablanormal">

</xml_diff>